<commit_message>
1.2.3.18 Team usage step 0: each member shares sealed monthly totals; Billing page renamed Anthropic Usage
Co-Authored-By: Claude Opus 5.5 <noreply@anthropic.com>
</commit_message>
<xml_diff>
--- a/BILLING_TEAM_USAGE_DESIGN.docx
+++ b/BILLING_TEAM_USAGE_DESIGN.docx
@@ -2224,6 +2224,50 @@
       </w:r>
     </w:p>
     <w:p>
+      <w:r>
+        <w:rPr>
+          <w:b w:val="0"/>
+        </w:rPr>
+        <w:t xml:space="preserve">Also in step 3 (Boaz, 2026-10-13): a Help entry that recommends </w:t>
+      </w:r>
+      <w:r>
+        <w:rPr>
+          <w:b/>
+        </w:rPr>
+        <w:t>one browser per person</w:t>
+      </w:r>
+      <w:r>
+        <w:rPr>
+          <w:b w:val="0"/>
+        </w:rPr>
+        <w:t>, and says what to do</w:t>
+      </w:r>
+    </w:p>
+    <w:p>
+      <w:r>
+        <w:rPr>
+          <w:b w:val="0"/>
+        </w:rPr>
+        <w:t>for a second one - the Team Lead invites it under the same name and puts it into the same groups; the person copies</w:t>
+      </w:r>
+    </w:p>
+    <w:p>
+      <w:r>
+        <w:rPr>
+          <w:b w:val="0"/>
+        </w:rPr>
+        <w:t>their own settings with Backup in the first browser and Restore in the second. It stays until the sign-in item of</w:t>
+      </w:r>
+    </w:p>
+    <w:p>
+      <w:r>
+        <w:rPr>
+          <w:b w:val="0"/>
+        </w:rPr>
+        <w:t>the roadmap makes one person one member.</w:t>
+      </w:r>
+    </w:p>
+    <w:p>
       <w:pPr>
         <w:pStyle w:val="Heading2"/>
       </w:pPr>

</xml_diff>